<commit_message>
docs(marketing,community): add account-setup note, migrate Linktree setup to /links, refresh WhatsApp group structure
- Playbook Ch.4: add "IG Business, TikTok Personal" nuance and account-ownership hygiene
- Playbook Ch.5: replace Linktree setup with swimbuddz.com/links; replace three obsolete Linktree bullets with GA4 event details, automatic top-link behavior, and the correct file to edit when changing non-top links
- WhatsApp playbook: rewrite Group Setup to describe the actual WA Community (New Here? entry → main Community → per-location Club groups → per-cohort Academy groups)

Co-Authored-By: Claude Opus 4 (1M context) <noreply@anthropic.com>
</commit_message>
<xml_diff>
--- a/docs/marketing/swimbuddz_social_media_playbook.docx
+++ b/docs/marketing/swimbuddz_social_media_playbook.docx
@@ -2939,7 +2939,7 @@
         <w:rPr>
           <w:rFonts w:ascii="Arial" w:cs="Arial" w:eastAsia="Arial" w:hAnsi="Arial"/>
         </w:rPr>
-        <w:t xml:space="preserve">5. Linktree Setup</w:t>
+        <w:t xml:space="preserve">5. Your Link-in-Bio Page (swimbuddz.com/links)</w:t>
       </w:r>
     </w:p>
     <w:p>
@@ -2952,7 +2952,20 @@
           <w:sz w:val="22"/>
           <w:szCs w:val="22"/>
         </w:rPr>
-        <w:t xml:space="preserve">Linktree is a single-page landing between your social bios and your website. It solves the one-link-in-bio problem.</w:t>
+        <w:t xml:space="preserve">SwimBuddz ships its own link-in-bio page at swimbuddz.com/links rather than using Linktree. It solves the same one-link-in-bio problem but keeps all traffic on our own domain, removes third-party branding, preserves our analytics, and costs nothing ongoing.</w:t>
+      </w:r>
+    </w:p>
+    <w:p>
+      <w:pPr>
+        <w:spacing w:after="140"/>
+      </w:pPr>
+      <w:r>
+        <w:rPr>
+          <w:rFonts w:ascii="Arial" w:cs="Arial" w:eastAsia="Arial" w:hAnsi="Arial"/>
+          <w:sz w:val="22"/>
+          <w:szCs w:val="22"/>
+        </w:rPr>
+        <w:t xml:space="preserve">The Linktree setup steps below are preserved for reference (the link-order principles and conversion-funnel logic still apply). To change the links themselves, edit swimbuddz-frontend/src/app/(public)/links/page.tsx and deploy. Paste swimbuddz.com/links into both the Instagram and TikTok bio fields.</w:t>
       </w:r>
     </w:p>
     <w:p>
@@ -3613,7 +3626,7 @@
           <w:sz w:val="22"/>
           <w:szCs w:val="22"/>
         </w:rPr>
-        <w:t xml:space="preserve">Enable analytics (free tier includes basic click tracking)</w:t>
+        <w:t xml:space="preserve">Analytics are already wired up via GA4 (configured in the frontend root layout). In GA4, watch the Pages report for /links traffic and the Events report for links_card_click events — these fire every time a visitor taps a card, with params link_id, destination, primary, and (when a cohort is open) cohort_id.</w:t>
       </w:r>
     </w:p>
     <w:p>
@@ -3631,7 +3644,7 @@
           <w:sz w:val="22"/>
           <w:szCs w:val="22"/>
         </w:rPr>
-        <w:t xml:space="preserve">Add Instagram and TikTok social icons at the top</w:t>
+        <w:t xml:space="preserve">Instagram + TikTok social icons already render at the bottom of the /links page (and in the site footer) via the shared SocialLinks component. No per-platform step needed.</w:t>
       </w:r>
     </w:p>
     <w:p>
@@ -3649,7 +3662,7 @@
           <w:sz w:val="22"/>
           <w:szCs w:val="22"/>
         </w:rPr>
-        <w:t xml:space="preserve">Update the top link seasonally — new cohort opening? Change first link to sign-up page.</w:t>
+        <w:t xml:space="preserve">The top link updates automatically. /links fetches enrollable cohorts from the academy service on each request (cached for 5 minutes) and surfaces the next one’s start date + location in the primary CTA. When no cohort is open, it falls back to the evergreen “Join the next Academy cohort” wording. To change the non-top links themselves, edit the SECONDARY_LINKS array in swimbuddz-frontend/src/app/(public)/links/page.tsx and deploy.</w:t>
       </w:r>
     </w:p>
     <w:p>

</xml_diff>